<commit_message>
Použiť upravenú predlohu zápisnice z volebného zhromaždenia (v0.14.0)
Co-Authored-By: Juraj Jablonický <juraj.jablonicky@gmail.com>
</commit_message>
<xml_diff>
--- a/src/volby_dekana/assets/zapisnica_template.docx
+++ b/src/volby_dekana/assets/zapisnica_template.docx
@@ -402,7 +402,7 @@
                 <w:i/>
                 <w:iCs/>
               </w:rPr>
-              <w:t>Meno, priezvisko, tituly kandidáta</w:t>
+              <w:t xml:space="preserve">Meno, priezvisko, tituly </w:t>
             </w:r>
           </w:p>
         </w:tc>
@@ -497,7 +497,7 @@
                 <w:i/>
                 <w:iCs/>
               </w:rPr>
-              <w:t>Meno, priezvisko, tituly kandidáta</w:t>
+              <w:t xml:space="preserve">Meno, priezvisko, tituly </w:t>
             </w:r>
           </w:p>
         </w:tc>
@@ -592,7 +592,7 @@
                 <w:i/>
                 <w:iCs/>
               </w:rPr>
-              <w:t>Meno, priezvisko, tituly kandidáta</w:t>
+              <w:t xml:space="preserve">Meno, priezvisko, tituly </w:t>
             </w:r>
           </w:p>
         </w:tc>
@@ -684,7 +684,7 @@
                 <w:i/>
                 <w:iCs/>
               </w:rPr>
-              <w:t>Meno, priezvisko, tituly kandidáta</w:t>
+              <w:t xml:space="preserve">Meno, priezvisko, tituly </w:t>
             </w:r>
           </w:p>
         </w:tc>
@@ -1086,7 +1086,15 @@
         <w:t>P</w:t>
       </w:r>
       <w:r>
-        <w:t>osluchárni CH (Tr. A. Hlinku 2</w:t>
+        <w:t>osluchárni CH (</w:t>
+      </w:r>
+      <w:proofErr w:type="spellStart"/>
+      <w:r>
+        <w:t>Tr</w:t>
+      </w:r>
+      <w:proofErr w:type="spellEnd"/>
+      <w:r>
+        <w:t>. A. Hlinku 2</w:t>
       </w:r>
       <w:r>
         <w:t>, 949 76 Nitra)</w:t>
@@ -1487,6 +1495,7 @@
         <w:rPr>
           <w:b/>
         </w:rPr>
+        <w:lastRenderedPageBreak/>
         <w:t>1. kolo voľby</w:t>
       </w:r>
     </w:p>
@@ -2084,6 +2093,7 @@
         <w:jc w:val="both"/>
       </w:pPr>
       <w:r>
+        <w:lastRenderedPageBreak/>
         <w:t>Zápisnica bola vyhotovená v písomnej forme</w:t>
       </w:r>
       <w:r>
@@ -2320,6 +2330,7 @@
         <w:docPartUnique/>
       </w:docPartObj>
     </w:sdtPr>
+    <w:sdtEndPr/>
     <w:sdtContent>
       <w:sdt>
         <w:sdtPr>
@@ -2333,6 +2344,7 @@
             <w:docPartUnique/>
           </w:docPartObj>
         </w:sdtPr>
+        <w:sdtEndPr/>
         <w:sdtContent>
           <w:p>
             <w:pPr>

</xml_diff>